<commit_message>
S1: núcleo de SEVEN-G (N-01 a N-14) y principio de proporcionalidad (D145)
Unifica en 01 §14.1 las condiciones de declaración y las reglas que nunca
se omiten; 94 §3 y P61 lo repiten; principio 11 en 01 §3; 94 §2.3
principio, práctica e instrumento; glosario y curso (ES/EN). Sección 37
de la verificación. Lectura de PNG sin System.Drawing en curso_pptx.ps1 y
reintento de puerto en los servidores locales de prueba (Linux).

Co-Authored-By: Claude Opus 5.5 <noreply@anthropic.com>
Claude-Session: https://claude.ai/code/session_014iYio6LvvzJ7Wvzr7BZcsM
</commit_message>
<xml_diff>
--- a/SEVEN-G/docx/en/plantillas/P61_SEVEN-G_Declaracion_de_aplicacion_de_SEVEN-G.docx
+++ b/SEVEN-G/docx/en/plantillas/P61_SEVEN-G_Declaracion_de_aplicacion_de_SEVEN-G.docx
@@ -80,7 +80,7 @@
               <w:pStyle w:val="Celda"/>
             </w:pPr>
             <w:r>
-              <w:t xml:space="preserve">0.1 (working draft)</w:t>
+              <w:t xml:space="preserve">0.2 (working draft)</w:t>
             </w:r>
           </w:p>
         </w:tc>
@@ -108,7 +108,7 @@
               <w:pStyle w:val="Celda"/>
             </w:pPr>
             <w:r>
-              <w:t xml:space="preserve">19-09-2026</w:t>
+              <w:t xml:space="preserve">01-10-2026</w:t>
             </w:r>
           </w:p>
         </w:tc>
@@ -223,7 +223,7 @@
         <w:t xml:space="preserve">verifiable self-declaration</w:t>
       </w:r>
       <w:r>
-        <w:t xml:space="preserve">: each of the seven conditions in 01 §14 is linked to its evidence and to the result of an audit, and the text makes clear that it is not a certification.</w:t>
+        <w:t xml:space="preserve">: each of the fourteen core rules (01 §14.1) is linked to its evidence and to the result of an audit, and the text makes clear that it is not a certification.</w:t>
       </w:r>
     </w:p>
     <w:p>
@@ -580,7 +580,7 @@
         <w:t xml:space="preserve">Full declaration</w:t>
       </w:r>
       <w:r>
-        <w:t xml:space="preserve">: only if the seven conditions in 01 §14 are met and the audit of the declaration is Conformant or Conformant with observations. With a Nonconformant outcome, the company may not declare that it applies SEVEN-G; it may state that it is in the process of implementation (38 §11.3).</w:t>
+        <w:t xml:space="preserve">: only if the fourteen core rules in 01 §14.1 are met and the audit of the declaration is Conformant or Conformant with observations. With a Nonconformant outcome, the company may not declare that it applies SEVEN-G; it may state that it is in the process of implementation (38 §11.3).</w:t>
       </w:r>
     </w:p>
     <w:p>
@@ -606,7 +606,7 @@
         <w:t xml:space="preserve">uses</w:t>
       </w:r>
       <w:r>
-        <w:t xml:space="preserve">, with the wording in 91 §6.1, and does not invoke the seven conditions.</w:t>
+        <w:t xml:space="preserve">, with the wording in 91 §6.1, and does not invoke the core.</w:t>
       </w:r>
     </w:p>
     <w:p>
@@ -786,6 +786,44 @@
             </w:pPr>
             <w:r>
               <w:t xml:space="preserve">Number and date (for example, 0.1 · 16-09-2026).</w:t>
+            </w:r>
+          </w:p>
+        </w:tc>
+      </w:tr>
+      <w:tr>
+        <w:tc>
+          <w:tcPr>
+            <w:tcW w:w="3213" w:type="dxa"/>
+          </w:tcPr>
+          <w:p>
+            <w:pPr>
+              <w:pStyle w:val="Celda"/>
+            </w:pPr>
+            <w:r>
+              <w:t xml:space="preserve">Core version applied</w:t>
+            </w:r>
+          </w:p>
+        </w:tc>
+        <w:tc>
+          <w:tcPr>
+            <w:tcW w:w="3213" w:type="dxa"/>
+          </w:tcPr>
+          <w:p>
+            <w:pPr>
+              <w:pStyle w:val="Celda"/>
+            </w:pPr>
+          </w:p>
+        </w:tc>
+        <w:tc>
+          <w:tcPr>
+            <w:tcW w:w="3213" w:type="dxa"/>
+          </w:tcPr>
+          <w:p>
+            <w:pPr>
+              <w:pStyle w:val="Celda"/>
+            </w:pPr>
+            <w:r>
+              <w:t xml:space="preserve">Version of the core in 01 §14.1 (for example, 1 · 01-10-2026).</w:t>
             </w:r>
           </w:p>
         </w:tc>
@@ -1741,7 +1779,7 @@
     </w:p>
     <w:p>
       <w:r>
-        <w:t xml:space="preserve">In a full declaration, the corporate cycle, the initiative lifecycle, the governance system and the value measurement rules must appear as applied, because the conditions in 01 §14 require them.</w:t>
+        <w:t xml:space="preserve">In a full declaration, the corporate cycle, the initiative lifecycle, the governance system and the value measurement rules must appear as applied, because the core (01 §14.1) requires them.</w:t>
       </w:r>
     </w:p>
     <w:p>
@@ -1990,7 +2028,7 @@
         <w:pStyle w:val="Heading1"/>
       </w:pPr>
       <w:r>
-        <w:t xml:space="preserve">6. Conditions in 01 §14 and evidence</w:t>
+        <w:t xml:space="preserve">6. Core rules (01 §14.1) and evidence</w:t>
       </w:r>
     </w:p>
     <w:tbl>
@@ -2025,7 +2063,7 @@
               <w:rPr>
                 <w:b/>
               </w:rPr>
-              <w:t xml:space="preserve">No.</w:t>
+              <w:t xml:space="preserve">Code</w:t>
             </w:r>
           </w:p>
         </w:tc>
@@ -2042,7 +2080,7 @@
               <w:rPr>
                 <w:b/>
               </w:rPr>
-              <w:t xml:space="preserve">Condition</w:t>
+              <w:t xml:space="preserve">Core rule</w:t>
             </w:r>
           </w:p>
         </w:tc>
@@ -2110,35 +2148,858 @@
               <w:rPr>
                 <w:b/>
               </w:rPr>
-              <w:t xml:space="preserve">Audit result for the condition</w:t>
-            </w:r>
-          </w:p>
-        </w:tc>
-      </w:tr>
-      <w:tr>
-        <w:tc>
-          <w:tcPr>
-            <w:tcW w:w="1606" w:type="dxa"/>
-          </w:tcPr>
-          <w:p>
-            <w:pPr>
-              <w:pStyle w:val="Celda"/>
-            </w:pPr>
-            <w:r>
-              <w:t xml:space="preserve">1</w:t>
-            </w:r>
-          </w:p>
-        </w:tc>
-        <w:tc>
-          <w:tcPr>
-            <w:tcW w:w="1606" w:type="dxa"/>
-          </w:tcPr>
-          <w:p>
-            <w:pPr>
-              <w:pStyle w:val="Celda"/>
-            </w:pPr>
-            <w:r>
-              <w:t xml:space="preserve">C1 and C2 completed; AI thesis, ambition per sphere and risk appetite approved by the board.</w:t>
+              <w:t xml:space="preserve">Audit result for the rule</w:t>
+            </w:r>
+          </w:p>
+        </w:tc>
+      </w:tr>
+      <w:tr>
+        <w:tc>
+          <w:tcPr>
+            <w:tcW w:w="1606" w:type="dxa"/>
+          </w:tcPr>
+          <w:p>
+            <w:pPr>
+              <w:pStyle w:val="Celda"/>
+            </w:pPr>
+            <w:r>
+              <w:t xml:space="preserve">N-01</w:t>
+            </w:r>
+          </w:p>
+        </w:tc>
+        <w:tc>
+          <w:tcPr>
+            <w:tcW w:w="1606" w:type="dxa"/>
+          </w:tcPr>
+          <w:p>
+            <w:pPr>
+              <w:pStyle w:val="Celda"/>
+            </w:pPr>
+            <w:r>
+              <w:t xml:space="preserve">Complete inventory with owner, regulatory classification and intensity.</w:t>
+            </w:r>
+          </w:p>
+        </w:tc>
+        <w:tc>
+          <w:tcPr>
+            <w:tcW w:w="1606" w:type="dxa"/>
+          </w:tcPr>
+          <w:p>
+            <w:pPr>
+              <w:pStyle w:val="Celda"/>
+            </w:pPr>
+            <w:r>
+              <w:t xml:space="preserve">D6.05</w:t>
+            </w:r>
+          </w:p>
+        </w:tc>
+        <w:tc>
+          <w:tcPr>
+            <w:tcW w:w="1606" w:type="dxa"/>
+          </w:tcPr>
+          <w:p>
+            <w:pPr>
+              <w:pStyle w:val="Celda"/>
+            </w:pPr>
+          </w:p>
+        </w:tc>
+        <w:tc>
+          <w:tcPr>
+            <w:tcW w:w="1606" w:type="dxa"/>
+          </w:tcPr>
+          <w:p>
+            <w:pPr>
+              <w:pStyle w:val="Celda"/>
+            </w:pPr>
+            <w:r>
+              <w:t xml:space="preserve">T02; reconciliation of the inventory (32 §9).</w:t>
+            </w:r>
+          </w:p>
+        </w:tc>
+        <w:tc>
+          <w:tcPr>
+            <w:tcW w:w="1606" w:type="dxa"/>
+          </w:tcPr>
+          <w:p>
+            <w:pPr>
+              <w:pStyle w:val="Celda"/>
+            </w:pPr>
+          </w:p>
+        </w:tc>
+      </w:tr>
+      <w:tr>
+        <w:tc>
+          <w:tcPr>
+            <w:tcW w:w="1606" w:type="dxa"/>
+          </w:tcPr>
+          <w:p>
+            <w:pPr>
+              <w:pStyle w:val="Celda"/>
+            </w:pPr>
+            <w:r>
+              <w:t xml:space="preserve">N-02</w:t>
+            </w:r>
+          </w:p>
+        </w:tc>
+        <w:tc>
+          <w:tcPr>
+            <w:tcW w:w="1606" w:type="dxa"/>
+          </w:tcPr>
+          <w:p>
+            <w:pPr>
+              <w:pStyle w:val="Celda"/>
+            </w:pPr>
+            <w:r>
+              <w:t xml:space="preserve">Initiative register with the traceability in 01 §6.11.</w:t>
+            </w:r>
+          </w:p>
+        </w:tc>
+        <w:tc>
+          <w:tcPr>
+            <w:tcW w:w="1606" w:type="dxa"/>
+          </w:tcPr>
+          <w:p>
+            <w:pPr>
+              <w:pStyle w:val="Celda"/>
+            </w:pPr>
+            <w:r>
+              <w:t xml:space="preserve">D2.05</w:t>
+            </w:r>
+          </w:p>
+        </w:tc>
+        <w:tc>
+          <w:tcPr>
+            <w:tcW w:w="1606" w:type="dxa"/>
+          </w:tcPr>
+          <w:p>
+            <w:pPr>
+              <w:pStyle w:val="Celda"/>
+            </w:pPr>
+          </w:p>
+        </w:tc>
+        <w:tc>
+          <w:tcPr>
+            <w:tcW w:w="1606" w:type="dxa"/>
+          </w:tcPr>
+          <w:p>
+            <w:pPr>
+              <w:pStyle w:val="Celda"/>
+            </w:pPr>
+            <w:r>
+              <w:t xml:space="preserve">T01.</w:t>
+            </w:r>
+          </w:p>
+        </w:tc>
+        <w:tc>
+          <w:tcPr>
+            <w:tcW w:w="1606" w:type="dxa"/>
+          </w:tcPr>
+          <w:p>
+            <w:pPr>
+              <w:pStyle w:val="Celda"/>
+            </w:pPr>
+          </w:p>
+        </w:tc>
+      </w:tr>
+      <w:tr>
+        <w:tc>
+          <w:tcPr>
+            <w:tcW w:w="1606" w:type="dxa"/>
+          </w:tcPr>
+          <w:p>
+            <w:pPr>
+              <w:pStyle w:val="Celda"/>
+            </w:pPr>
+            <w:r>
+              <w:t xml:space="preserve">N-03</w:t>
+            </w:r>
+          </w:p>
+        </w:tc>
+        <w:tc>
+          <w:tcPr>
+            <w:tcW w:w="1606" w:type="dxa"/>
+          </w:tcPr>
+          <w:p>
+            <w:pPr>
+              <w:pStyle w:val="Celda"/>
+            </w:pPr>
+            <w:r>
+              <w:t xml:space="preserve">Intensity determined for each initiative and reviewed at G3 and at each R6.</w:t>
+            </w:r>
+          </w:p>
+        </w:tc>
+        <w:tc>
+          <w:tcPr>
+            <w:tcW w:w="1606" w:type="dxa"/>
+          </w:tcPr>
+          <w:p>
+            <w:pPr>
+              <w:pStyle w:val="Celda"/>
+            </w:pPr>
+            <w:r>
+              <w:t xml:space="preserve">—</w:t>
+            </w:r>
+          </w:p>
+        </w:tc>
+        <w:tc>
+          <w:tcPr>
+            <w:tcW w:w="1606" w:type="dxa"/>
+          </w:tcPr>
+          <w:p>
+            <w:pPr>
+              <w:pStyle w:val="Celda"/>
+            </w:pPr>
+          </w:p>
+        </w:tc>
+        <w:tc>
+          <w:tcPr>
+            <w:tcW w:w="1606" w:type="dxa"/>
+          </w:tcPr>
+          <w:p>
+            <w:pPr>
+              <w:pStyle w:val="Celda"/>
+            </w:pPr>
+            <w:r>
+              <w:t xml:space="preserve">T01 (P04, T04).</w:t>
+            </w:r>
+          </w:p>
+        </w:tc>
+        <w:tc>
+          <w:tcPr>
+            <w:tcW w:w="1606" w:type="dxa"/>
+          </w:tcPr>
+          <w:p>
+            <w:pPr>
+              <w:pStyle w:val="Celda"/>
+            </w:pPr>
+          </w:p>
+        </w:tc>
+      </w:tr>
+      <w:tr>
+        <w:tc>
+          <w:tcPr>
+            <w:tcW w:w="1606" w:type="dxa"/>
+          </w:tcPr>
+          <w:p>
+            <w:pPr>
+              <w:pStyle w:val="Celda"/>
+            </w:pPr>
+            <w:r>
+              <w:t xml:space="preserve">N-04</w:t>
+            </w:r>
+          </w:p>
+        </w:tc>
+        <w:tc>
+          <w:tcPr>
+            <w:tcW w:w="1606" w:type="dxa"/>
+          </w:tcPr>
+          <w:p>
+            <w:pPr>
+              <w:pStyle w:val="Celda"/>
+            </w:pPr>
+            <w:r>
+              <w:t xml:space="preserve">All new initiatives go through the lifecycle with their </w:t>
+            </w:r>
+            <w:r>
+              <w:rPr>
+                <w:i/>
+              </w:rPr>
+              <w:t xml:space="preserve">gates</w:t>
+            </w:r>
+            <w:r>
+              <w:t xml:space="preserve"> recorded.</w:t>
+            </w:r>
+          </w:p>
+        </w:tc>
+        <w:tc>
+          <w:tcPr>
+            <w:tcW w:w="1606" w:type="dxa"/>
+          </w:tcPr>
+          <w:p>
+            <w:pPr>
+              <w:pStyle w:val="Celda"/>
+            </w:pPr>
+            <w:r>
+              <w:t xml:space="preserve">D2.06</w:t>
+            </w:r>
+          </w:p>
+        </w:tc>
+        <w:tc>
+          <w:tcPr>
+            <w:tcW w:w="1606" w:type="dxa"/>
+          </w:tcPr>
+          <w:p>
+            <w:pPr>
+              <w:pStyle w:val="Celda"/>
+            </w:pPr>
+          </w:p>
+        </w:tc>
+        <w:tc>
+          <w:tcPr>
+            <w:tcW w:w="1606" w:type="dxa"/>
+          </w:tcPr>
+          <w:p>
+            <w:pPr>
+              <w:pStyle w:val="Celda"/>
+            </w:pPr>
+            <w:r>
+              <w:t xml:space="preserve">T01, T03, P29.</w:t>
+            </w:r>
+          </w:p>
+        </w:tc>
+        <w:tc>
+          <w:tcPr>
+            <w:tcW w:w="1606" w:type="dxa"/>
+          </w:tcPr>
+          <w:p>
+            <w:pPr>
+              <w:pStyle w:val="Celda"/>
+            </w:pPr>
+          </w:p>
+        </w:tc>
+      </w:tr>
+      <w:tr>
+        <w:tc>
+          <w:tcPr>
+            <w:tcW w:w="1606" w:type="dxa"/>
+          </w:tcPr>
+          <w:p>
+            <w:pPr>
+              <w:pStyle w:val="Celda"/>
+            </w:pPr>
+            <w:r>
+              <w:t xml:space="preserve">N-05</w:t>
+            </w:r>
+          </w:p>
+        </w:tc>
+        <w:tc>
+          <w:tcPr>
+            <w:tcW w:w="1606" w:type="dxa"/>
+          </w:tcPr>
+          <w:p>
+            <w:pPr>
+              <w:pStyle w:val="Celda"/>
+            </w:pPr>
+            <w:r>
+              <w:t xml:space="preserve">G3 always decided separately.</w:t>
+            </w:r>
+          </w:p>
+        </w:tc>
+        <w:tc>
+          <w:tcPr>
+            <w:tcW w:w="1606" w:type="dxa"/>
+          </w:tcPr>
+          <w:p>
+            <w:pPr>
+              <w:pStyle w:val="Celda"/>
+            </w:pPr>
+            <w:r>
+              <w:t xml:space="preserve">—</w:t>
+            </w:r>
+          </w:p>
+        </w:tc>
+        <w:tc>
+          <w:tcPr>
+            <w:tcW w:w="1606" w:type="dxa"/>
+          </w:tcPr>
+          <w:p>
+            <w:pPr>
+              <w:pStyle w:val="Celda"/>
+            </w:pPr>
+          </w:p>
+        </w:tc>
+        <w:tc>
+          <w:tcPr>
+            <w:tcW w:w="1606" w:type="dxa"/>
+          </w:tcPr>
+          <w:p>
+            <w:pPr>
+              <w:pStyle w:val="Celda"/>
+            </w:pPr>
+            <w:r>
+              <w:t xml:space="preserve">T01 (G3 decisions).</w:t>
+            </w:r>
+          </w:p>
+        </w:tc>
+        <w:tc>
+          <w:tcPr>
+            <w:tcW w:w="1606" w:type="dxa"/>
+          </w:tcPr>
+          <w:p>
+            <w:pPr>
+              <w:pStyle w:val="Celda"/>
+            </w:pPr>
+          </w:p>
+        </w:tc>
+      </w:tr>
+      <w:tr>
+        <w:tc>
+          <w:tcPr>
+            <w:tcW w:w="1606" w:type="dxa"/>
+          </w:tcPr>
+          <w:p>
+            <w:pPr>
+              <w:pStyle w:val="Celda"/>
+            </w:pPr>
+            <w:r>
+              <w:t xml:space="preserve">N-06</w:t>
+            </w:r>
+          </w:p>
+        </w:tc>
+        <w:tc>
+          <w:tcPr>
+            <w:tcW w:w="1606" w:type="dxa"/>
+          </w:tcPr>
+          <w:p>
+            <w:pPr>
+              <w:pStyle w:val="Celda"/>
+            </w:pPr>
+            <w:r>
+              <w:t xml:space="preserve">Roles and bodies assigned in line with the incompatibilities in 01 §8.2.</w:t>
+            </w:r>
+          </w:p>
+        </w:tc>
+        <w:tc>
+          <w:tcPr>
+            <w:tcW w:w="1606" w:type="dxa"/>
+          </w:tcPr>
+          <w:p>
+            <w:pPr>
+              <w:pStyle w:val="Celda"/>
+            </w:pPr>
+            <w:r>
+              <w:t xml:space="preserve">D1.07 · D1.08</w:t>
+            </w:r>
+          </w:p>
+        </w:tc>
+        <w:tc>
+          <w:tcPr>
+            <w:tcW w:w="1606" w:type="dxa"/>
+          </w:tcPr>
+          <w:p>
+            <w:pPr>
+              <w:pStyle w:val="Celda"/>
+            </w:pPr>
+          </w:p>
+        </w:tc>
+        <w:tc>
+          <w:tcPr>
+            <w:tcW w:w="1606" w:type="dxa"/>
+          </w:tcPr>
+          <w:p>
+            <w:pPr>
+              <w:pStyle w:val="Celda"/>
+            </w:pPr>
+            <w:r>
+              <w:t xml:space="preserve">Mandates (document 30); P03.</w:t>
+            </w:r>
+          </w:p>
+        </w:tc>
+        <w:tc>
+          <w:tcPr>
+            <w:tcW w:w="1606" w:type="dxa"/>
+          </w:tcPr>
+          <w:p>
+            <w:pPr>
+              <w:pStyle w:val="Celda"/>
+            </w:pPr>
+          </w:p>
+        </w:tc>
+      </w:tr>
+      <w:tr>
+        <w:tc>
+          <w:tcPr>
+            <w:tcW w:w="1606" w:type="dxa"/>
+          </w:tcPr>
+          <w:p>
+            <w:pPr>
+              <w:pStyle w:val="Celda"/>
+            </w:pPr>
+            <w:r>
+              <w:t xml:space="preserve">N-07</w:t>
+            </w:r>
+          </w:p>
+        </w:tc>
+        <w:tc>
+          <w:tcPr>
+            <w:tcW w:w="1606" w:type="dxa"/>
+          </w:tcPr>
+          <w:p>
+            <w:pPr>
+              <w:pStyle w:val="Celda"/>
+            </w:pPr>
+            <w:r>
+              <w:t xml:space="preserve">Dual validation and evidence prior to the decision.</w:t>
+            </w:r>
+          </w:p>
+        </w:tc>
+        <w:tc>
+          <w:tcPr>
+            <w:tcW w:w="1606" w:type="dxa"/>
+          </w:tcPr>
+          <w:p>
+            <w:pPr>
+              <w:pStyle w:val="Celda"/>
+            </w:pPr>
+            <w:r>
+              <w:t xml:space="preserve">—</w:t>
+            </w:r>
+          </w:p>
+        </w:tc>
+        <w:tc>
+          <w:tcPr>
+            <w:tcW w:w="1606" w:type="dxa"/>
+          </w:tcPr>
+          <w:p>
+            <w:pPr>
+              <w:pStyle w:val="Celda"/>
+            </w:pPr>
+          </w:p>
+        </w:tc>
+        <w:tc>
+          <w:tcPr>
+            <w:tcW w:w="1606" w:type="dxa"/>
+          </w:tcPr>
+          <w:p>
+            <w:pPr>
+              <w:pStyle w:val="Celda"/>
+            </w:pPr>
+            <w:r>
+              <w:t xml:space="preserve">T01 (verifier and evidence dates).</w:t>
+            </w:r>
+          </w:p>
+        </w:tc>
+        <w:tc>
+          <w:tcPr>
+            <w:tcW w:w="1606" w:type="dxa"/>
+          </w:tcPr>
+          <w:p>
+            <w:pPr>
+              <w:pStyle w:val="Celda"/>
+            </w:pPr>
+          </w:p>
+        </w:tc>
+      </w:tr>
+      <w:tr>
+        <w:tc>
+          <w:tcPr>
+            <w:tcW w:w="1606" w:type="dxa"/>
+          </w:tcPr>
+          <w:p>
+            <w:pPr>
+              <w:pStyle w:val="Celda"/>
+            </w:pPr>
+            <w:r>
+              <w:t xml:space="preserve">N-08</w:t>
+            </w:r>
+          </w:p>
+        </w:tc>
+        <w:tc>
+          <w:tcPr>
+            <w:tcW w:w="1606" w:type="dxa"/>
+          </w:tcPr>
+          <w:p>
+            <w:pPr>
+              <w:pStyle w:val="Celda"/>
+            </w:pPr>
+            <w:r>
+              <w:t xml:space="preserve">No "Yes ◆" criterion accepted as a condition.</w:t>
+            </w:r>
+          </w:p>
+        </w:tc>
+        <w:tc>
+          <w:tcPr>
+            <w:tcW w:w="1606" w:type="dxa"/>
+          </w:tcPr>
+          <w:p>
+            <w:pPr>
+              <w:pStyle w:val="Celda"/>
+            </w:pPr>
+            <w:r>
+              <w:t xml:space="preserve">—</w:t>
+            </w:r>
+          </w:p>
+        </w:tc>
+        <w:tc>
+          <w:tcPr>
+            <w:tcW w:w="1606" w:type="dxa"/>
+          </w:tcPr>
+          <w:p>
+            <w:pPr>
+              <w:pStyle w:val="Celda"/>
+            </w:pPr>
+          </w:p>
+        </w:tc>
+        <w:tc>
+          <w:tcPr>
+            <w:tcW w:w="1606" w:type="dxa"/>
+          </w:tcPr>
+          <w:p>
+            <w:pPr>
+              <w:pStyle w:val="Celda"/>
+            </w:pPr>
+            <w:r>
+              <w:t xml:space="preserve">T01, T03.</w:t>
+            </w:r>
+          </w:p>
+        </w:tc>
+        <w:tc>
+          <w:tcPr>
+            <w:tcW w:w="1606" w:type="dxa"/>
+          </w:tcPr>
+          <w:p>
+            <w:pPr>
+              <w:pStyle w:val="Celda"/>
+            </w:pPr>
+          </w:p>
+        </w:tc>
+      </w:tr>
+      <w:tr>
+        <w:tc>
+          <w:tcPr>
+            <w:tcW w:w="1606" w:type="dxa"/>
+          </w:tcPr>
+          <w:p>
+            <w:pPr>
+              <w:pStyle w:val="Celda"/>
+            </w:pPr>
+            <w:r>
+              <w:t xml:space="preserve">N-09</w:t>
+            </w:r>
+          </w:p>
+        </w:tc>
+        <w:tc>
+          <w:tcPr>
+            <w:tcW w:w="1606" w:type="dxa"/>
+          </w:tcPr>
+          <w:p>
+            <w:pPr>
+              <w:pStyle w:val="Celda"/>
+            </w:pPr>
+            <w:r>
+              <w:t xml:space="preserve">Value hypothesis with baseline and stop criteria before feasibility.</w:t>
+            </w:r>
+          </w:p>
+        </w:tc>
+        <w:tc>
+          <w:tcPr>
+            <w:tcW w:w="1606" w:type="dxa"/>
+          </w:tcPr>
+          <w:p>
+            <w:pPr>
+              <w:pStyle w:val="Celda"/>
+            </w:pPr>
+            <w:r>
+              <w:t xml:space="preserve">—</w:t>
+            </w:r>
+          </w:p>
+        </w:tc>
+        <w:tc>
+          <w:tcPr>
+            <w:tcW w:w="1606" w:type="dxa"/>
+          </w:tcPr>
+          <w:p>
+            <w:pPr>
+              <w:pStyle w:val="Celda"/>
+            </w:pPr>
+          </w:p>
+        </w:tc>
+        <w:tc>
+          <w:tcPr>
+            <w:tcW w:w="1606" w:type="dxa"/>
+          </w:tcPr>
+          <w:p>
+            <w:pPr>
+              <w:pStyle w:val="Celda"/>
+            </w:pPr>
+            <w:r>
+              <w:t xml:space="preserve">P08, P09; T11.</w:t>
+            </w:r>
+          </w:p>
+        </w:tc>
+        <w:tc>
+          <w:tcPr>
+            <w:tcW w:w="1606" w:type="dxa"/>
+          </w:tcPr>
+          <w:p>
+            <w:pPr>
+              <w:pStyle w:val="Celda"/>
+            </w:pPr>
+          </w:p>
+        </w:tc>
+      </w:tr>
+      <w:tr>
+        <w:tc>
+          <w:tcPr>
+            <w:tcW w:w="1606" w:type="dxa"/>
+          </w:tcPr>
+          <w:p>
+            <w:pPr>
+              <w:pStyle w:val="Celda"/>
+            </w:pPr>
+            <w:r>
+              <w:t xml:space="preserve">N-10</w:t>
+            </w:r>
+          </w:p>
+        </w:tc>
+        <w:tc>
+          <w:tcPr>
+            <w:tcW w:w="1606" w:type="dxa"/>
+          </w:tcPr>
+          <w:p>
+            <w:pPr>
+              <w:pStyle w:val="Celda"/>
+            </w:pPr>
+            <w:r>
+              <w:t xml:space="preserve">Regulatory classification and risk register before design; no Critical risk without board approval.</w:t>
+            </w:r>
+          </w:p>
+        </w:tc>
+        <w:tc>
+          <w:tcPr>
+            <w:tcW w:w="1606" w:type="dxa"/>
+          </w:tcPr>
+          <w:p>
+            <w:pPr>
+              <w:pStyle w:val="Celda"/>
+            </w:pPr>
+            <w:r>
+              <w:t xml:space="preserve">—</w:t>
+            </w:r>
+          </w:p>
+        </w:tc>
+        <w:tc>
+          <w:tcPr>
+            <w:tcW w:w="1606" w:type="dxa"/>
+          </w:tcPr>
+          <w:p>
+            <w:pPr>
+              <w:pStyle w:val="Celda"/>
+            </w:pPr>
+          </w:p>
+        </w:tc>
+        <w:tc>
+          <w:tcPr>
+            <w:tcW w:w="1606" w:type="dxa"/>
+          </w:tcPr>
+          <w:p>
+            <w:pPr>
+              <w:pStyle w:val="Celda"/>
+            </w:pPr>
+            <w:r>
+              <w:t xml:space="preserve">P11, P12; T06.</w:t>
+            </w:r>
+          </w:p>
+        </w:tc>
+        <w:tc>
+          <w:tcPr>
+            <w:tcW w:w="1606" w:type="dxa"/>
+          </w:tcPr>
+          <w:p>
+            <w:pPr>
+              <w:pStyle w:val="Celda"/>
+            </w:pPr>
+          </w:p>
+        </w:tc>
+      </w:tr>
+      <w:tr>
+        <w:tc>
+          <w:tcPr>
+            <w:tcW w:w="1606" w:type="dxa"/>
+          </w:tcPr>
+          <w:p>
+            <w:pPr>
+              <w:pStyle w:val="Celda"/>
+            </w:pPr>
+            <w:r>
+              <w:t xml:space="preserve">N-11</w:t>
+            </w:r>
+          </w:p>
+        </w:tc>
+        <w:tc>
+          <w:tcPr>
+            <w:tcW w:w="1606" w:type="dxa"/>
+          </w:tcPr>
+          <w:p>
+            <w:pPr>
+              <w:pStyle w:val="Celda"/>
+            </w:pPr>
+            <w:r>
+              <w:t xml:space="preserve">Tested rollback and current continuity review in production; regularisation of earlier systems within the C2 time limit.</w:t>
+            </w:r>
+          </w:p>
+        </w:tc>
+        <w:tc>
+          <w:tcPr>
+            <w:tcW w:w="1606" w:type="dxa"/>
+          </w:tcPr>
+          <w:p>
+            <w:pPr>
+              <w:pStyle w:val="Celda"/>
+            </w:pPr>
+            <w:r>
+              <w:t xml:space="preserve">D4.07</w:t>
+            </w:r>
+          </w:p>
+        </w:tc>
+        <w:tc>
+          <w:tcPr>
+            <w:tcW w:w="1606" w:type="dxa"/>
+          </w:tcPr>
+          <w:p>
+            <w:pPr>
+              <w:pStyle w:val="Celda"/>
+            </w:pPr>
+          </w:p>
+        </w:tc>
+        <w:tc>
+          <w:tcPr>
+            <w:tcW w:w="1606" w:type="dxa"/>
+          </w:tcPr>
+          <w:p>
+            <w:pPr>
+              <w:pStyle w:val="Celda"/>
+            </w:pPr>
+            <w:r>
+              <w:t xml:space="preserve">T01; R6 minutes; regularisation list.</w:t>
+            </w:r>
+          </w:p>
+        </w:tc>
+        <w:tc>
+          <w:tcPr>
+            <w:tcW w:w="1606" w:type="dxa"/>
+          </w:tcPr>
+          <w:p>
+            <w:pPr>
+              <w:pStyle w:val="Celda"/>
+            </w:pPr>
+          </w:p>
+        </w:tc>
+      </w:tr>
+      <w:tr>
+        <w:tc>
+          <w:tcPr>
+            <w:tcW w:w="1606" w:type="dxa"/>
+          </w:tcPr>
+          <w:p>
+            <w:pPr>
+              <w:pStyle w:val="Celda"/>
+            </w:pPr>
+            <w:r>
+              <w:t xml:space="preserve">N-12</w:t>
+            </w:r>
+          </w:p>
+        </w:tc>
+        <w:tc>
+          <w:tcPr>
+            <w:tcW w:w="1606" w:type="dxa"/>
+          </w:tcPr>
+          <w:p>
+            <w:pPr>
+              <w:pStyle w:val="Celda"/>
+            </w:pPr>
+            <w:r>
+              <w:t xml:space="preserve">C1 and C2 completed; thesis, ambition per sphere and risk appetite approved by the board; quarterly information.</w:t>
             </w:r>
           </w:p>
         </w:tc>
@@ -2174,350 +3035,45 @@
               <w:pStyle w:val="Celda"/>
             </w:pPr>
             <w:r>
-              <w:t xml:space="preserve">Board minutes; thesis and appetite document; C1 report.</w:t>
-            </w:r>
-          </w:p>
-        </w:tc>
-        <w:tc>
-          <w:tcPr>
-            <w:tcW w:w="1606" w:type="dxa"/>
-          </w:tcPr>
-          <w:p>
-            <w:pPr>
-              <w:pStyle w:val="Celda"/>
-            </w:pPr>
-          </w:p>
-        </w:tc>
-      </w:tr>
-      <w:tr>
-        <w:tc>
-          <w:tcPr>
-            <w:tcW w:w="1606" w:type="dxa"/>
-          </w:tcPr>
-          <w:p>
-            <w:pPr>
-              <w:pStyle w:val="Celda"/>
-            </w:pPr>
-            <w:r>
-              <w:t xml:space="preserve">2</w:t>
-            </w:r>
-          </w:p>
-        </w:tc>
-        <w:tc>
-          <w:tcPr>
-            <w:tcW w:w="1606" w:type="dxa"/>
-          </w:tcPr>
-          <w:p>
-            <w:pPr>
-              <w:pStyle w:val="Celda"/>
-            </w:pPr>
-            <w:r>
-              <w:t xml:space="preserve">Inventory with regulatory classification, intensity and owner; initiative register with the traceability in 01 §6.11.</w:t>
-            </w:r>
-          </w:p>
-        </w:tc>
-        <w:tc>
-          <w:tcPr>
-            <w:tcW w:w="1606" w:type="dxa"/>
-          </w:tcPr>
-          <w:p>
-            <w:pPr>
-              <w:pStyle w:val="Celda"/>
-            </w:pPr>
-            <w:r>
-              <w:t xml:space="preserve">D6.05 · D2.05</w:t>
-            </w:r>
-          </w:p>
-        </w:tc>
-        <w:tc>
-          <w:tcPr>
-            <w:tcW w:w="1606" w:type="dxa"/>
-          </w:tcPr>
-          <w:p>
-            <w:pPr>
-              <w:pStyle w:val="Celda"/>
-            </w:pPr>
-          </w:p>
-        </w:tc>
-        <w:tc>
-          <w:tcPr>
-            <w:tcW w:w="1606" w:type="dxa"/>
-          </w:tcPr>
-          <w:p>
-            <w:pPr>
-              <w:pStyle w:val="Celda"/>
-            </w:pPr>
-            <w:r>
-              <w:t xml:space="preserve">T02, T01; reconciliation of the inventory (32 §9).</w:t>
-            </w:r>
-          </w:p>
-        </w:tc>
-        <w:tc>
-          <w:tcPr>
-            <w:tcW w:w="1606" w:type="dxa"/>
-          </w:tcPr>
-          <w:p>
-            <w:pPr>
-              <w:pStyle w:val="Celda"/>
-            </w:pPr>
-          </w:p>
-        </w:tc>
-      </w:tr>
-      <w:tr>
-        <w:tc>
-          <w:tcPr>
-            <w:tcW w:w="1606" w:type="dxa"/>
-          </w:tcPr>
-          <w:p>
-            <w:pPr>
-              <w:pStyle w:val="Celda"/>
-            </w:pPr>
-            <w:r>
-              <w:t xml:space="preserve">3</w:t>
-            </w:r>
-          </w:p>
-        </w:tc>
-        <w:tc>
-          <w:tcPr>
-            <w:tcW w:w="1606" w:type="dxa"/>
-          </w:tcPr>
-          <w:p>
-            <w:pPr>
-              <w:pStyle w:val="Celda"/>
-            </w:pPr>
-            <w:r>
-              <w:t xml:space="preserve">Roles and bodies assigned in line with the incompatibilities in 01 §8.2.</w:t>
-            </w:r>
-          </w:p>
-        </w:tc>
-        <w:tc>
-          <w:tcPr>
-            <w:tcW w:w="1606" w:type="dxa"/>
-          </w:tcPr>
-          <w:p>
-            <w:pPr>
-              <w:pStyle w:val="Celda"/>
-            </w:pPr>
-            <w:r>
-              <w:t xml:space="preserve">D1.07 · D1.08</w:t>
-            </w:r>
-          </w:p>
-        </w:tc>
-        <w:tc>
-          <w:tcPr>
-            <w:tcW w:w="1606" w:type="dxa"/>
-          </w:tcPr>
-          <w:p>
-            <w:pPr>
-              <w:pStyle w:val="Celda"/>
-            </w:pPr>
-          </w:p>
-        </w:tc>
-        <w:tc>
-          <w:tcPr>
-            <w:tcW w:w="1606" w:type="dxa"/>
-          </w:tcPr>
-          <w:p>
-            <w:pPr>
-              <w:pStyle w:val="Celda"/>
-            </w:pPr>
-            <w:r>
-              <w:t xml:space="preserve">Mandates (document 30); P03.</w:t>
-            </w:r>
-          </w:p>
-        </w:tc>
-        <w:tc>
-          <w:tcPr>
-            <w:tcW w:w="1606" w:type="dxa"/>
-          </w:tcPr>
-          <w:p>
-            <w:pPr>
-              <w:pStyle w:val="Celda"/>
-            </w:pPr>
-          </w:p>
-        </w:tc>
-      </w:tr>
-      <w:tr>
-        <w:tc>
-          <w:tcPr>
-            <w:tcW w:w="1606" w:type="dxa"/>
-          </w:tcPr>
-          <w:p>
-            <w:pPr>
-              <w:pStyle w:val="Celda"/>
-            </w:pPr>
-            <w:r>
-              <w:t xml:space="preserve">4</w:t>
-            </w:r>
-          </w:p>
-        </w:tc>
-        <w:tc>
-          <w:tcPr>
-            <w:tcW w:w="1606" w:type="dxa"/>
-          </w:tcPr>
-          <w:p>
-            <w:pPr>
-              <w:pStyle w:val="Celda"/>
-            </w:pPr>
-            <w:r>
-              <w:t xml:space="preserve">All new initiatives go through the lifecycle with their </w:t>
-            </w:r>
-            <w:r>
-              <w:rPr>
-                <w:i/>
-              </w:rPr>
-              <w:t xml:space="preserve">gates</w:t>
-            </w:r>
-            <w:r>
-              <w:t xml:space="preserve"> recorded.</w:t>
-            </w:r>
-          </w:p>
-        </w:tc>
-        <w:tc>
-          <w:tcPr>
-            <w:tcW w:w="1606" w:type="dxa"/>
-          </w:tcPr>
-          <w:p>
-            <w:pPr>
-              <w:pStyle w:val="Celda"/>
-            </w:pPr>
-            <w:r>
-              <w:t xml:space="preserve">D2.06</w:t>
-            </w:r>
-          </w:p>
-        </w:tc>
-        <w:tc>
-          <w:tcPr>
-            <w:tcW w:w="1606" w:type="dxa"/>
-          </w:tcPr>
-          <w:p>
-            <w:pPr>
-              <w:pStyle w:val="Celda"/>
-            </w:pPr>
-          </w:p>
-        </w:tc>
-        <w:tc>
-          <w:tcPr>
-            <w:tcW w:w="1606" w:type="dxa"/>
-          </w:tcPr>
-          <w:p>
-            <w:pPr>
-              <w:pStyle w:val="Celda"/>
-            </w:pPr>
-            <w:r>
-              <w:t xml:space="preserve">T01, T03, P29.</w:t>
-            </w:r>
-          </w:p>
-        </w:tc>
-        <w:tc>
-          <w:tcPr>
-            <w:tcW w:w="1606" w:type="dxa"/>
-          </w:tcPr>
-          <w:p>
-            <w:pPr>
-              <w:pStyle w:val="Celda"/>
-            </w:pPr>
-          </w:p>
-        </w:tc>
-      </w:tr>
-      <w:tr>
-        <w:tc>
-          <w:tcPr>
-            <w:tcW w:w="1606" w:type="dxa"/>
-          </w:tcPr>
-          <w:p>
-            <w:pPr>
-              <w:pStyle w:val="Celda"/>
-            </w:pPr>
-            <w:r>
-              <w:t xml:space="preserve">5</w:t>
-            </w:r>
-          </w:p>
-        </w:tc>
-        <w:tc>
-          <w:tcPr>
-            <w:tcW w:w="1606" w:type="dxa"/>
-          </w:tcPr>
-          <w:p>
-            <w:pPr>
-              <w:pStyle w:val="Celda"/>
-            </w:pPr>
-            <w:r>
-              <w:t xml:space="preserve">All initiatives in production have a current continuity review.</w:t>
-            </w:r>
-          </w:p>
-        </w:tc>
-        <w:tc>
-          <w:tcPr>
-            <w:tcW w:w="1606" w:type="dxa"/>
-          </w:tcPr>
-          <w:p>
-            <w:pPr>
-              <w:pStyle w:val="Celda"/>
-            </w:pPr>
-            <w:r>
-              <w:t xml:space="preserve">D4.07</w:t>
-            </w:r>
-          </w:p>
-        </w:tc>
-        <w:tc>
-          <w:tcPr>
-            <w:tcW w:w="1606" w:type="dxa"/>
-          </w:tcPr>
-          <w:p>
-            <w:pPr>
-              <w:pStyle w:val="Celda"/>
-            </w:pPr>
-          </w:p>
-        </w:tc>
-        <w:tc>
-          <w:tcPr>
-            <w:tcW w:w="1606" w:type="dxa"/>
-          </w:tcPr>
-          <w:p>
-            <w:pPr>
-              <w:pStyle w:val="Celda"/>
-            </w:pPr>
-            <w:r>
-              <w:t xml:space="preserve">T01; R6 minutes.</w:t>
-            </w:r>
-          </w:p>
-        </w:tc>
-        <w:tc>
-          <w:tcPr>
-            <w:tcW w:w="1606" w:type="dxa"/>
-          </w:tcPr>
-          <w:p>
-            <w:pPr>
-              <w:pStyle w:val="Celda"/>
-            </w:pPr>
-          </w:p>
-        </w:tc>
-      </w:tr>
-      <w:tr>
-        <w:tc>
-          <w:tcPr>
-            <w:tcW w:w="1606" w:type="dxa"/>
-          </w:tcPr>
-          <w:p>
-            <w:pPr>
-              <w:pStyle w:val="Celda"/>
-            </w:pPr>
-            <w:r>
-              <w:t xml:space="preserve">6</w:t>
-            </w:r>
-          </w:p>
-        </w:tc>
-        <w:tc>
-          <w:tcPr>
-            <w:tcW w:w="1606" w:type="dxa"/>
-          </w:tcPr>
-          <w:p>
-            <w:pPr>
-              <w:pStyle w:val="Celda"/>
-            </w:pPr>
-            <w:r>
-              <w:t xml:space="preserve">Applies the value measurement rules and reports to the board with the oversight dashboard.</w:t>
+              <w:t xml:space="preserve">Board minutes; thesis and appetite; C1 report.</w:t>
+            </w:r>
+          </w:p>
+        </w:tc>
+        <w:tc>
+          <w:tcPr>
+            <w:tcW w:w="1606" w:type="dxa"/>
+          </w:tcPr>
+          <w:p>
+            <w:pPr>
+              <w:pStyle w:val="Celda"/>
+            </w:pPr>
+          </w:p>
+        </w:tc>
+      </w:tr>
+      <w:tr>
+        <w:tc>
+          <w:tcPr>
+            <w:tcW w:w="1606" w:type="dxa"/>
+          </w:tcPr>
+          <w:p>
+            <w:pPr>
+              <w:pStyle w:val="Celda"/>
+            </w:pPr>
+            <w:r>
+              <w:t xml:space="preserve">N-13</w:t>
+            </w:r>
+          </w:p>
+        </w:tc>
+        <w:tc>
+          <w:tcPr>
+            <w:tcW w:w="1606" w:type="dxa"/>
+          </w:tcPr>
+          <w:p>
+            <w:pPr>
+              <w:pStyle w:val="Celda"/>
+            </w:pPr>
+            <w:r>
+              <w:t xml:space="preserve">Value measurement rules applied and reporting to the board with the oversight dashboard.</w:t>
             </w:r>
           </w:p>
         </w:tc>
@@ -2578,20 +3134,20 @@
               <w:pStyle w:val="Celda"/>
             </w:pPr>
             <w:r>
-              <w:t xml:space="preserve">7</w:t>
-            </w:r>
-          </w:p>
-        </w:tc>
-        <w:tc>
-          <w:tcPr>
-            <w:tcW w:w="1606" w:type="dxa"/>
-          </w:tcPr>
-          <w:p>
-            <w:pPr>
-              <w:pStyle w:val="Celda"/>
-            </w:pPr>
-            <w:r>
-              <w:t xml:space="preserve">Manages nonconformities using the process in 01 §12.</w:t>
+              <w:t xml:space="preserve">N-14</w:t>
+            </w:r>
+          </w:p>
+        </w:tc>
+        <w:tc>
+          <w:tcPr>
+            <w:tcW w:w="1606" w:type="dxa"/>
+          </w:tcPr>
+          <w:p>
+            <w:pPr>
+              <w:pStyle w:val="Celda"/>
+            </w:pPr>
+            <w:r>
+              <w:t xml:space="preserve">Nonconformities managed with the process in 01 §12.</w:t>
             </w:r>
           </w:p>
         </w:tc>
@@ -2628,80 +3184,6 @@
             </w:pPr>
             <w:r>
               <w:t xml:space="preserve">T08; reports to the board committee.</w:t>
-            </w:r>
-          </w:p>
-        </w:tc>
-        <w:tc>
-          <w:tcPr>
-            <w:tcW w:w="1606" w:type="dxa"/>
-          </w:tcPr>
-          <w:p>
-            <w:pPr>
-              <w:pStyle w:val="Celda"/>
-            </w:pPr>
-          </w:p>
-        </w:tc>
-      </w:tr>
-      <w:tr>
-        <w:tc>
-          <w:tcPr>
-            <w:tcW w:w="1606" w:type="dxa"/>
-          </w:tcPr>
-          <w:p>
-            <w:pPr>
-              <w:pStyle w:val="Celda"/>
-            </w:pPr>
-            <w:r>
-              <w:t xml:space="preserve">—</w:t>
-            </w:r>
-          </w:p>
-        </w:tc>
-        <w:tc>
-          <w:tcPr>
-            <w:tcW w:w="1606" w:type="dxa"/>
-          </w:tcPr>
-          <w:p>
-            <w:pPr>
-              <w:pStyle w:val="Celda"/>
-            </w:pPr>
-            <w:r>
-              <w:t xml:space="preserve">Regularisation of initiatives in production that predate adoption, within the time limit approved in C2.</w:t>
-            </w:r>
-          </w:p>
-        </w:tc>
-        <w:tc>
-          <w:tcPr>
-            <w:tcW w:w="1606" w:type="dxa"/>
-          </w:tcPr>
-          <w:p>
-            <w:pPr>
-              <w:pStyle w:val="Celda"/>
-            </w:pPr>
-            <w:r>
-              <w:t xml:space="preserve">—</w:t>
-            </w:r>
-          </w:p>
-        </w:tc>
-        <w:tc>
-          <w:tcPr>
-            <w:tcW w:w="1606" w:type="dxa"/>
-          </w:tcPr>
-          <w:p>
-            <w:pPr>
-              <w:pStyle w:val="Celda"/>
-            </w:pPr>
-          </w:p>
-        </w:tc>
-        <w:tc>
-          <w:tcPr>
-            <w:tcW w:w="1606" w:type="dxa"/>
-          </w:tcPr>
-          <w:p>
-            <w:pPr>
-              <w:pStyle w:val="Celda"/>
-            </w:pPr>
-            <w:r>
-              <w:t xml:space="preserve">List of initiatives, time limit and review equivalent to G7.</w:t>
             </w:r>
           </w:p>
         </w:tc>
@@ -3573,7 +4055,7 @@
               <w:pStyle w:val="Celda"/>
             </w:pPr>
             <w:r>
-              <w:t xml:space="preserve">Nonconformant outcome in an audit or re-audit; major or critical nonconformity in one of the seven conditions; undeclared change of perimeter. In those cases, the declaration is withdrawn from communications until a re-audit is passed.</w:t>
+              <w:t xml:space="preserve">Nonconformant outcome in an audit or re-audit; major or critical nonconformity in one of the core rules; undeclared change of perimeter. In those cases, the declaration is withdrawn from communications until a re-audit is passed.</w:t>
             </w:r>
           </w:p>
         </w:tc>
@@ -4017,7 +4499,7 @@
               <w:pStyle w:val="Celda"/>
             </w:pPr>
             <w:r>
-              <w:t xml:space="preserve">The seven conditions have linked evidence, and questions D1.05, D1.07, D1.08, D2.05, D2.06, D4.07, D6.05, D6.07, D7.05 and D7.06 are "Yes" in a verified assessment.</w:t>
+              <w:t xml:space="preserve">The fourteen core rules have linked evidence, and questions D1.05, D1.07, D1.08, D2.05, D2.06, D4.07, D6.05, D6.07, D7.05 and D7.06 are "Yes" in a verified assessment.</w:t>
             </w:r>
           </w:p>
         </w:tc>
@@ -4903,6 +5385,47 @@
             </w:r>
             <w:r>
               <w:t xml:space="preserve"> in document 11; distinguishes the full declaration from the modular one (01 §1.2) and warns that there is no official certification in version 0.x.</w:t>
+            </w:r>
+          </w:p>
+        </w:tc>
+      </w:tr>
+      <w:tr>
+        <w:tc>
+          <w:tcPr>
+            <w:tcW w:w="3213" w:type="dxa"/>
+          </w:tcPr>
+          <w:p>
+            <w:pPr>
+              <w:pStyle w:val="Celda"/>
+            </w:pPr>
+            <w:r>
+              <w:t xml:space="preserve">0.2</w:t>
+            </w:r>
+          </w:p>
+        </w:tc>
+        <w:tc>
+          <w:tcPr>
+            <w:tcW w:w="3213" w:type="dxa"/>
+          </w:tcPr>
+          <w:p>
+            <w:pPr>
+              <w:pStyle w:val="Celda"/>
+            </w:pPr>
+            <w:r>
+              <w:t xml:space="preserve">01-10-2026</w:t>
+            </w:r>
+          </w:p>
+        </w:tc>
+        <w:tc>
+          <w:tcPr>
+            <w:tcW w:w="3213" w:type="dxa"/>
+          </w:tcPr>
+          <w:p>
+            <w:pPr>
+              <w:pStyle w:val="Celda"/>
+            </w:pPr>
+            <w:r>
+              <w:t xml:space="preserve">The seven conditions in 01 §14 become the fourteen core rules (01 §14.1, N-01 to N-14), with their question in document 11 and their evidence; new field "Core version applied".</w:t>
             </w:r>
           </w:p>
         </w:tc>

</xml_diff>